<commit_message>
Add sheep episode and Fiji period to experience file
Co-Authored-By: Claude Opus 5.5 <noreply@anthropic.com>
Claude-Session: https://claude.ai/code/session_01UunSGkA7xxcu1ZJiDN1zG2
</commit_message>
<xml_diff>
--- a/output/フィジーでの経験の整理.docx
+++ b/output/フィジーでの経験の整理.docx
@@ -38,7 +38,7 @@
           <w:sz w:val="28"/>
           <w:szCs w:val="28"/>
         </w:rPr>
-        <w:t xml:space="preserve">1．全体の内訳</w:t>
+        <w:t xml:space="preserve">1．基本情報</w:t>
       </w:r>
     </w:p>
     <w:p>
@@ -47,7 +47,29 @@
         <w:ind w:firstLine="210"/>
       </w:pPr>
       <w:r>
-        <w:t xml:space="preserve">フィジーで初めてやったこと・知ったこと・感じたことは、全部で140項目あった。種類ごとに分けると次のようになる。</w:t>
+        <w:t xml:space="preserve">滞在期間は2019年5月から2021年11月までの約2年半で、高校生のときの交換留学である。2020年以降は新型コロナウイルスの流行と重なり、ロックダウンや隔離も経験した。</w:t>
+      </w:r>
+    </w:p>
+    <w:p>
+      <w:pPr>
+        <w:keepNext/>
+        <w:spacing w:after="140" w:before="280"/>
+      </w:pPr>
+      <w:r>
+        <w:rPr>
+          <w:sz w:val="28"/>
+          <w:szCs w:val="28"/>
+        </w:rPr>
+        <w:t xml:space="preserve">2．全体の内訳</w:t>
+      </w:r>
+    </w:p>
+    <w:p>
+      <w:pPr>
+        <w:spacing w:after="120" w:line="360"/>
+        <w:ind w:firstLine="210"/>
+      </w:pPr>
+      <w:r>
+        <w:t xml:space="preserve">フィジーで初めてやったこと・知ったこと・感じたことは、全部で141項目あった。種類ごとに分けると次のようになる。</w:t>
       </w:r>
     </w:p>
     <w:tbl>
@@ -226,7 +248,7 @@
                 <w:sz w:val="19"/>
                 <w:szCs w:val="19"/>
               </w:rPr>
-              <w:t xml:space="preserve">30</w:t>
+              <w:t xml:space="preserve">31</w:t>
             </w:r>
           </w:p>
         </w:tc>
@@ -255,7 +277,7 @@
                 <w:sz w:val="19"/>
                 <w:szCs w:val="19"/>
               </w:rPr>
-              <w:t xml:space="preserve">手でご飯を食べる、初めてのマンゴー・パパイヤ、ロティーにお茶をつける、朝ごはんが5日間同じ</w:t>
+              <w:t xml:space="preserve">羊の解体、手でご飯を食べる、初めてのマンゴー・パパイヤ、ロティーにお茶をつける、朝ごはんが5日間同じ</w:t>
             </w:r>
           </w:p>
         </w:tc>
@@ -1104,7 +1126,7 @@
           <w:sz w:val="28"/>
           <w:szCs w:val="28"/>
         </w:rPr>
-        <w:t xml:space="preserve">2．リストから見えてくること</w:t>
+        <w:t xml:space="preserve">3．リストから見えてくること</w:t>
       </w:r>
     </w:p>
     <w:p>
@@ -1126,7 +1148,7 @@
         <w:ind w:firstLine="210"/>
       </w:pPr>
       <w:r>
-        <w:t xml:space="preserve">140項目のうち、食（30）と生活環境（26）で約4割を占める。これは、6.2で立てた「フィジーでは食事や日常生活の場面で衝突が起きやすい」という予想と一致する。</w:t>
+        <w:t xml:space="preserve">141項目のうち、食（31）と生活環境（26）で約4割を占める。これは、6.2で立てた「フィジーでは食事や日常生活の場面で衝突が起きやすい」という予想と一致する。</w:t>
       </w:r>
     </w:p>
     <w:p>
@@ -1170,7 +1192,7 @@
         <w:ind w:firstLine="210"/>
       </w:pPr>
       <w:r>
-        <w:t xml:space="preserve">つらかった・受け入れにくかったと考えられる経験（表の※）は、ヒンディー語の悪口（94）、中指を立てられる（121）、バスの外から唾をかけられる（135）、かばんをとられそうになる（128）、犬に噛まれる（68）、カンピロバクター（129）、心細さ（88）、ロックダウンなどである。一方、手で食べる、お祈り、肉を食べない期間などの食や宗教の習慣は、多くが楽しい経験や新しい発見として書かれている。つまり、習慣の違いは「初めて」として楽しさに変わりやすいが、人からの敵意や危険、病気は楽しさに変わりにくいと考えられる。これは、先生の「みんなが受け入れられるわけではない」という指摘に対して、どこが分かれ道になるのかを示す手がかりになる。</w:t>
+        <w:t xml:space="preserve">つらかった・受け入れにくかったと考えられる経験（表の※）は、ホストファミリーが飼っていた羊の解体、ヒンディー語の悪口（94）、中指を立てられる（121）、バスの外から唾をかけられる（135）、かばんをとられそうになる（128）、犬に噛まれる（68）、カンピロバクター（129）、心細さ（88）、ロックダウンなどである。一方、手で食べる、お祈り、肉を食べない期間などの食や宗教の習慣は、多くが楽しい経験や新しい発見として書かれている。ただし羊の解体のように、命に関わる価値観の違いは、習慣であっても受け入れにくい。つまり、習慣の違いは「初めて」として楽しさに変わりやすいが、人からの敵意や危険、病気は楽しさに変わりにくいと考えられる。これは、先生の「みんなが受け入れられるわけではない」という指摘に対して、どこが分かれ道になるのかを示す手がかりになる。</w:t>
       </w:r>
     </w:p>
     <w:p>
@@ -1205,7 +1227,7 @@
           <w:sz w:val="28"/>
           <w:szCs w:val="28"/>
         </w:rPr>
-        <w:t xml:space="preserve">3．種類ごとの全リスト</w:t>
+        <w:t xml:space="preserve">4．種類ごとの全リスト</w:t>
       </w:r>
     </w:p>
     <w:p>
@@ -1214,7 +1236,7 @@
         <w:ind w:firstLine="210"/>
       </w:pPr>
       <w:r>
-        <w:t xml:space="preserve">番号は元のリストの番号。※は、つらかった・受け入れにくかったと考えられる経験。</w:t>
+        <w:t xml:space="preserve">番号は元のリストの番号（起きた順番ではない）。「追加」は後から加えた項目。※は、つらかった・受け入れにくかったと考えられる経験。</w:t>
       </w:r>
     </w:p>
     <w:p>
@@ -1227,7 +1249,7 @@
           <w:b/>
           <w:bCs/>
         </w:rPr>
-        <w:t xml:space="preserve">食（30件）</w:t>
+        <w:t xml:space="preserve">食（31件）</w:t>
       </w:r>
     </w:p>
     <w:tbl>
@@ -3886,6 +3908,98 @@
             <w:pPr>
               <w:spacing w:line="280"/>
             </w:pPr>
+          </w:p>
+        </w:tc>
+      </w:tr>
+      <w:tr>
+        <w:trPr>
+          <w:cantSplit/>
+        </w:trPr>
+        <w:tc>
+          <w:tcPr>
+            <w:tcW w:type="dxa" w:w="1067"/>
+            <w:tcBorders>
+              <w:top w:val="single" w:color="999999" w:sz="4"/>
+              <w:left w:val="single" w:color="999999" w:sz="4"/>
+              <w:bottom w:val="single" w:color="999999" w:sz="4"/>
+              <w:right w:val="single" w:color="999999" w:sz="4"/>
+            </w:tcBorders>
+            <w:tcMar>
+              <w:top w:type="dxa" w:w="60"/>
+              <w:left w:type="dxa" w:w="100"/>
+              <w:bottom w:type="dxa" w:w="60"/>
+              <w:right w:type="dxa" w:w="100"/>
+            </w:tcMar>
+          </w:tcPr>
+          <w:p>
+            <w:pPr>
+              <w:spacing w:line="280"/>
+            </w:pPr>
+            <w:r>
+              <w:rPr>
+                <w:sz w:val="19"/>
+                <w:szCs w:val="19"/>
+              </w:rPr>
+              <w:t xml:space="preserve">追加</w:t>
+            </w:r>
+          </w:p>
+        </w:tc>
+        <w:tc>
+          <w:tcPr>
+            <w:tcW w:type="dxa" w:w="7469"/>
+            <w:tcBorders>
+              <w:top w:val="single" w:color="999999" w:sz="4"/>
+              <w:left w:val="single" w:color="999999" w:sz="4"/>
+              <w:bottom w:val="single" w:color="999999" w:sz="4"/>
+              <w:right w:val="single" w:color="999999" w:sz="4"/>
+            </w:tcBorders>
+            <w:tcMar>
+              <w:top w:type="dxa" w:w="60"/>
+              <w:left w:type="dxa" w:w="100"/>
+              <w:bottom w:type="dxa" w:w="60"/>
+              <w:right w:type="dxa" w:w="100"/>
+            </w:tcMar>
+          </w:tcPr>
+          <w:p>
+            <w:pPr>
+              <w:spacing w:line="280"/>
+            </w:pPr>
+            <w:r>
+              <w:rPr>
+                <w:sz w:val="19"/>
+                <w:szCs w:val="19"/>
+              </w:rPr>
+              <w:t xml:space="preserve">ホストファミリーが飼っていた羊が目の前で解体され、食卓に出てきたこと</w:t>
+            </w:r>
+          </w:p>
+        </w:tc>
+        <w:tc>
+          <w:tcPr>
+            <w:tcW w:type="dxa" w:w="534"/>
+            <w:tcBorders>
+              <w:top w:val="single" w:color="999999" w:sz="4"/>
+              <w:left w:val="single" w:color="999999" w:sz="4"/>
+              <w:bottom w:val="single" w:color="999999" w:sz="4"/>
+              <w:right w:val="single" w:color="999999" w:sz="4"/>
+            </w:tcBorders>
+            <w:tcMar>
+              <w:top w:type="dxa" w:w="60"/>
+              <w:left w:type="dxa" w:w="100"/>
+              <w:bottom w:type="dxa" w:w="60"/>
+              <w:right w:type="dxa" w:w="100"/>
+            </w:tcMar>
+          </w:tcPr>
+          <w:p>
+            <w:pPr>
+              <w:spacing w:line="280"/>
+            </w:pPr>
+            <w:r>
+              <w:rPr>
+                <w:sz w:val="19"/>
+                <w:szCs w:val="19"/>
+              </w:rPr>
+              <w:t xml:space="preserve">※</w:t>
+            </w:r>
           </w:p>
         </w:tc>
       </w:tr>
@@ -14561,7 +14675,7 @@
           <w:sz w:val="28"/>
           <w:szCs w:val="28"/>
         </w:rPr>
-        <w:t xml:space="preserve">4．確認したいこと</w:t>
+        <w:t xml:space="preserve">5．確認したいこと</w:t>
       </w:r>
     </w:p>
     <w:p>
@@ -14574,7 +14688,7 @@
         <w:spacing w:after="80" w:line="340"/>
       </w:pPr>
       <w:r>
-        <w:t xml:space="preserve">このリストは、起きた順番（時系列）に並んでいるか。順番がわかると、段階ごとの変化を分析できる</w:t>
+        <w:t xml:space="preserve">リストは起きた順番ではないため、段階ごとの変化を見るには時期がわかるとよい。主な項目だけでも「最初の頃（2019年）」「コロナ前後（2020年）」「最後の頃（2021年）」のどれにあたるか印を付ける</w:t>
       </w:r>
     </w:p>
     <w:p>
@@ -14587,7 +14701,7 @@
         <w:spacing w:after="80" w:line="340"/>
       </w:pPr>
       <w:r>
-        <w:t xml:space="preserve">羊の解体は、リストに入っていない。受け入れられなかった経験として、追加するか</w:t>
+        <w:t xml:space="preserve">※を付けた経験（羊の解体・悪口・中指・唾など）は、今どう感じているか。受け入れられないままか、気にならなくなったか</w:t>
       </w:r>
     </w:p>
     <w:p>
@@ -14600,20 +14714,7 @@
         <w:spacing w:after="80" w:line="340"/>
       </w:pPr>
       <w:r>
-        <w:t xml:space="preserve">※を付けた経験（悪口・中指・唾など）は、今どう感じているか。受け入れられないままか、気にならなくなったか</w:t>
-      </w:r>
-    </w:p>
-    <w:p>
-      <w:pPr>
-        <w:pStyle w:val="ListParagraph"/>
-        <w:numPr>
-          <w:ilvl w:val="0"/>
-          <w:numId w:val="2"/>
-        </w:numPr>
-        <w:spacing w:after="80" w:line="340"/>
-      </w:pPr>
-      <w:r>
-        <w:t xml:space="preserve">フィジーに行った時期と期間（コロナの時期と重なっているか）</w:t>
+        <w:t xml:space="preserve">論文の他の部分では「3年間」と書いているが、2019年5月〜2021年11月は約2年半。表記をそろえる</w:t>
       </w:r>
     </w:p>
     <w:sectPr>

</xml_diff>

<commit_message>
Set Fiji study period to about 2.5 years
Co-Authored-By: Claude Opus 5.5 <noreply@anthropic.com>
Claude-Session: https://claude.ai/code/session_01UunSGkA7xxcu1ZJiDN1zG2
</commit_message>
<xml_diff>
--- a/output/フィジーでの経験の整理.docx
+++ b/output/フィジーでの経験の整理.docx
@@ -14702,19 +14702,6 @@
       </w:pPr>
       <w:r>
         <w:t xml:space="preserve">※を付けた経験（羊の解体・悪口・中指・唾など）は、今どう感じているか。受け入れられないままか、気にならなくなったか</w:t>
-      </w:r>
-    </w:p>
-    <w:p>
-      <w:pPr>
-        <w:pStyle w:val="ListParagraph"/>
-        <w:numPr>
-          <w:ilvl w:val="0"/>
-          <w:numId w:val="2"/>
-        </w:numPr>
-        <w:spacing w:after="80" w:line="340"/>
-      </w:pPr>
-      <w:r>
-        <w:t xml:space="preserve">論文の他の部分では「3年間」と書いているが、2019年5月〜2021年11月は約2年半。表記をそろえる</w:t>
       </w:r>
     </w:p>
     <w:sectPr>

</xml_diff>